<commit_message>
changed the implementation to create the summary.csvs and not overwrite it after a second execution, adapted the read me accordingly, changed the Comparison.docx
</commit_message>
<xml_diff>
--- a/docs/ComparisonVMDPyMolOutput.docx
+++ b/docs/ComparisonVMDPyMolOutput.docx
@@ -1399,7 +1399,7 @@
                 <w:sz w:val="18"/>
                 <w:szCs w:val="18"/>
               </w:rPr>
-              <w:t xml:space="preserve">−0.01883</w:t>
+              <w:t xml:space="preserve">−0.01882</w:t>
             </w:r>
           </w:p>
         </w:tc>
@@ -1829,10 +1829,10 @@
           <w:b/>
           <w:bCs/>
         </w:rPr>
-        <w:t xml:space="preserve">Seventeen of the eighteen values are identical, and all nine colour scales are.</w:t>
-      </w:r>
-      <w:r>
-        <w:t xml:space="preserve"> The single exception is V_S,min of bromobenzene, −0.01882 against −0.01883, and it is not a disagreement: the true value is −0.018825, exactly on the rounding boundary. PyMOL rounds the full float once; the VMD side stores six decimals in the cube header, reads them back and rounds again, and the second rounding of an exact half can fall the other way.</w:t>
+        <w:t xml:space="preserve">All eighteen values are identical, and so are all nine colour scales.</w:t>
+      </w:r>
+      <w:r>
+        <w:t xml:space="preserve"> One number is worth a footnote. V_S,min of bromobenzene sits at −0.018825, exactly on the rounding boundary, and the VMD pipeline reports it as −0.01882 or −0.01883 depending on how the run reached it. A run that converts the grids reports −0.01882 from the full float. A run that finds the cubes already there reads the value back from the six decimals stamped in the cube header and rounds a second time, which lands on −0.01883. Both appear in the delivered set: results/brombenzol was converted, results/brombenzol_rainbow reused the cubes. It is a display artefact of an exact half, not a disagreement, and it is visible inside one pipeline as readily as between two.</w:t>
       </w:r>
     </w:p>
     <w:p>
@@ -1875,7 +1875,7 @@
       <w:r>
         <w:drawing>
           <wp:inline distT="0" distB="0" distL="0" distR="0">
-            <wp:extent cx="5905500" cy="2752725"/>
+            <wp:extent cx="5905500" cy="3133725"/>
             <wp:effectExtent t="0" r="0" b="0" l="0"/>
             <wp:docPr id="1" name="" descr="" title=""/>
             <wp:cNvGraphicFramePr>
@@ -1900,7 +1900,7 @@
                   <pic:spPr bwMode="auto">
                     <a:xfrm>
                       <a:off x="0" y="0"/>
-                      <a:ext cx="5905500" cy="2752725"/>
+                      <a:ext cx="5905500" cy="3133725"/>
                     </a:xfrm>
                     <a:prstGeom prst="rect">
                       <a:avLst/>
@@ -1953,7 +1953,7 @@
       <w:r>
         <w:drawing>
           <wp:inline distT="0" distB="0" distL="0" distR="0">
-            <wp:extent cx="5905500" cy="2600325"/>
+            <wp:extent cx="5905500" cy="3133725"/>
             <wp:effectExtent t="0" r="0" b="0" l="0"/>
             <wp:docPr id="1" name="" descr="" title=""/>
             <wp:cNvGraphicFramePr>
@@ -1978,7 +1978,7 @@
                   <pic:spPr bwMode="auto">
                     <a:xfrm>
                       <a:off x="0" y="0"/>
-                      <a:ext cx="5905500" cy="2600325"/>
+                      <a:ext cx="5905500" cy="3133725"/>
                     </a:xfrm>
                     <a:prstGeom prst="rect">
                       <a:avLst/>
@@ -2027,7 +2027,7 @@
         <w:t xml:space="preserve">This is the substantive finding. </w:t>
       </w:r>
       <w:r>
-        <w:t xml:space="preserve">In the PyMOL row the σ-hole grows visibly from chlorine through bromine to iodine: a pale centre, then a defined blue disc, then a large saturated cap, each inside a red belt. That trend is the chemistry the figure exists to show, and it can be read off the image without consulting a number. In the VMD row the same three molecules look nearly alike and washed out, and the trend is not readable.</w:t>
+        <w:t xml:space="preserve">In the PyMOL row the σ-hole grows visibly from chlorine through bromine to iodine: a pale centre, then a defined blue disc, then a large saturated cap, each inside a red belt. That trend is the chemistry the figure exists to show, and it can be read off the image without consulting a number. The VMD row carries the same trend but at much lower contrast: the blue core does grow from chlorine to iodine, yet the red belt barely separates from it, and the reading depends on knowing what to look for.</w:t>
       </w:r>
     </w:p>
     <w:p>
@@ -2035,7 +2035,17 @@
         <w:spacing w:after="140"/>
       </w:pPr>
       <w:r>
-        <w:t xml:space="preserve">Two causes stack here, and both are explained in section 4: the axial view is where the line of sight crosses the most transparent surface, and it is also the view where VMD's ray tracer fails most often and falls back to a window capture.</w:t>
+        <w:t xml:space="preserve">The middle panel of the VMD row shows the second cause on its own. </w:t>
+      </w:r>
+      <w:r>
+        <w:rPr>
+          <w:b/>
+          <w:bCs/>
+        </w:rPr>
+        <w:t xml:space="preserve">Chlorobenzene and iodobenzene were ray traced; bromobenzene between them is a window capture, because Tachyon aborted on that view.</w:t>
+      </w:r>
+      <w:r>
+        <w:t xml:space="preserve"> It is the flattest of the three and breaks the sequence, which is what a fallback image costs. Both causes are explained in section 4: the axial view is where the line of sight crosses the most transparent surface, and it is also the view VMD's ray tracer fails on most often.</w:t>
       </w:r>
     </w:p>
     <w:p>
@@ -2046,7 +2056,7 @@
       <w:r>
         <w:drawing>
           <wp:inline distT="0" distB="0" distL="0" distR="0">
-            <wp:extent cx="4476750" cy="2971800"/>
+            <wp:extent cx="4476750" cy="2800350"/>
             <wp:effectExtent t="0" r="0" b="0" l="0"/>
             <wp:docPr id="1" name="" descr="" title=""/>
             <wp:cNvGraphicFramePr>
@@ -2071,7 +2081,7 @@
                   <pic:spPr bwMode="auto">
                     <a:xfrm>
                       <a:off x="0" y="0"/>
-                      <a:ext cx="4476750" cy="2971800"/>
+                      <a:ext cx="4476750" cy="2800350"/>
                     </a:xfrm>
                     <a:prstGeom prst="rect">
                       <a:avLst/>
@@ -2339,7 +2349,7 @@
         <w:spacing w:after="120" w:before="240"/>
       </w:pPr>
       <w:r>
-        <w:t xml:space="preserve">VMD's ray tracer fails on a third of the views</w:t>
+        <w:t xml:space="preserve">VMD's ray tracer fails on about a third of the views, unpredictably</w:t>
       </w:r>
     </w:p>
     <w:p>
@@ -2347,7 +2357,15 @@
         <w:spacing w:after="140"/>
       </w:pPr>
       <w:r>
-        <w:t xml:space="preserve">TachyonInternal aborts when many transparent layers stack, on Windows with exit code 0xC0000374, heap corruption, and without an error message. The only symptom is a missing file. The pipeline renders in passes and keeps whatever each pass produced: full quality first, then the missing views as an OpenGL window capture, which preserves the transparency but is visibly less fine, and only then as an opaque surface. Across the nine molecules:</w:t>
+        <w:t xml:space="preserve">TachyonInternal aborts when many transparent layers stack, on Windows with exit code 0xC0000374, heap corruption, and without an error message. The only symptom is a missing file. The pipeline renders in passes and keeps whatever each pass produced: full quality first, then the missing views as an OpenGL window capture, which preserves the transparency but is visibly less fine, and only then as an opaque surface.</w:t>
+      </w:r>
+    </w:p>
+    <w:p>
+      <w:pPr>
+        <w:spacing w:after="140"/>
+      </w:pPr>
+      <w:r>
+        <w:t xml:space="preserve">The same nine molecules were rendered twice, from identical data with identical settings. The counts of views that fell back:</w:t>
       </w:r>
     </w:p>
     <w:tbl>
@@ -2363,8 +2381,9 @@
         </w:tblBorders>
       </w:tblPr>
       <w:tblGrid>
-        <w:gridCol w:w="3400"/>
-        <w:gridCol w:w="3600"/>
+        <w:gridCol w:w="3000"/>
+        <w:gridCol w:w="2000"/>
+        <w:gridCol w:w="2000"/>
       </w:tblGrid>
       <w:tr>
         <w:trPr>
@@ -2372,7 +2391,7 @@
         </w:trPr>
         <w:tc>
           <w:tcPr>
-            <w:tcW w:type="dxa" w:w="3400"/>
+            <w:tcW w:type="dxa" w:w="3000"/>
             <w:shd w:fill="EDEDED" w:val="clear"/>
             <w:tcMar>
               <w:top w:type="dxa" w:w="50"/>
@@ -2399,7 +2418,7 @@
         </w:tc>
         <w:tc>
           <w:tcPr>
-            <w:tcW w:type="dxa" w:w="3600"/>
+            <w:tcW w:type="dxa" w:w="2000"/>
             <w:shd w:fill="EDEDED" w:val="clear"/>
             <w:tcMar>
               <w:top w:type="dxa" w:w="50"/>
@@ -2420,7 +2439,34 @@
                 <w:sz w:val="18"/>
                 <w:szCs w:val="18"/>
               </w:rPr>
-              <w:t xml:space="preserve">Views that fell back to the window capture</w:t>
+              <w:t xml:space="preserve">first run</w:t>
+            </w:r>
+          </w:p>
+        </w:tc>
+        <w:tc>
+          <w:tcPr>
+            <w:tcW w:type="dxa" w:w="2000"/>
+            <w:shd w:fill="EDEDED" w:val="clear"/>
+            <w:tcMar>
+              <w:top w:type="dxa" w:w="50"/>
+              <w:left w:type="dxa" w:w="80"/>
+              <w:bottom w:type="dxa" w:w="50"/>
+              <w:right w:type="dxa" w:w="80"/>
+            </w:tcMar>
+          </w:tcPr>
+          <w:p>
+            <w:pPr>
+              <w:spacing w:after="0"/>
+              <w:jc w:val="left"/>
+            </w:pPr>
+            <w:r>
+              <w:rPr>
+                <w:b/>
+                <w:bCs/>
+                <w:sz w:val="18"/>
+                <w:szCs w:val="18"/>
+              </w:rPr>
+              <w:t xml:space="preserve">second run</w:t>
             </w:r>
           </w:p>
         </w:tc>
@@ -2428,7 +2474,7 @@
       <w:tr>
         <w:tc>
           <w:tcPr>
-            <w:tcW w:type="dxa" w:w="3400"/>
+            <w:tcW w:type="dxa" w:w="3000"/>
             <w:tcMar>
               <w:top w:type="dxa" w:w="50"/>
               <w:left w:type="dxa" w:w="80"/>
@@ -2454,7 +2500,34 @@
         </w:tc>
         <w:tc>
           <w:tcPr>
-            <w:tcW w:type="dxa" w:w="3600"/>
+            <w:tcW w:type="dxa" w:w="2000"/>
+            <w:tcMar>
+              <w:top w:type="dxa" w:w="50"/>
+              <w:left w:type="dxa" w:w="80"/>
+              <w:bottom w:type="dxa" w:w="50"/>
+              <w:right w:type="dxa" w:w="80"/>
+            </w:tcMar>
+          </w:tcPr>
+          <w:p>
+            <w:pPr>
+              <w:spacing w:after="0"/>
+              <w:jc w:val="right"/>
+            </w:pPr>
+            <w:r>
+              <w:rPr>
+                <w:rFonts w:ascii="Consolas" w:cs="Consolas" w:eastAsia="Consolas" w:hAnsi="Consolas"/>
+                <w:b w:val="false"/>
+                <w:bCs w:val="false"/>
+                <w:sz w:val="18"/>
+                <w:szCs w:val="18"/>
+              </w:rPr>
+              <w:t xml:space="preserve">0 of 3</w:t>
+            </w:r>
+          </w:p>
+        </w:tc>
+        <w:tc>
+          <w:tcPr>
+            <w:tcW w:type="dxa" w:w="2000"/>
             <w:tcMar>
               <w:top w:type="dxa" w:w="50"/>
               <w:left w:type="dxa" w:w="80"/>
@@ -2483,7 +2556,7 @@
       <w:tr>
         <w:tc>
           <w:tcPr>
-            <w:tcW w:type="dxa" w:w="3400"/>
+            <w:tcW w:type="dxa" w:w="3000"/>
             <w:tcMar>
               <w:top w:type="dxa" w:w="50"/>
               <w:left w:type="dxa" w:w="80"/>
@@ -2509,7 +2582,34 @@
         </w:tc>
         <w:tc>
           <w:tcPr>
-            <w:tcW w:type="dxa" w:w="3600"/>
+            <w:tcW w:type="dxa" w:w="2000"/>
+            <w:tcMar>
+              <w:top w:type="dxa" w:w="50"/>
+              <w:left w:type="dxa" w:w="80"/>
+              <w:bottom w:type="dxa" w:w="50"/>
+              <w:right w:type="dxa" w:w="80"/>
+            </w:tcMar>
+          </w:tcPr>
+          <w:p>
+            <w:pPr>
+              <w:spacing w:after="0"/>
+              <w:jc w:val="right"/>
+            </w:pPr>
+            <w:r>
+              <w:rPr>
+                <w:rFonts w:ascii="Consolas" w:cs="Consolas" w:eastAsia="Consolas" w:hAnsi="Consolas"/>
+                <w:b w:val="false"/>
+                <w:bCs w:val="false"/>
+                <w:sz w:val="18"/>
+                <w:szCs w:val="18"/>
+              </w:rPr>
+              <w:t xml:space="preserve">0 of 3</w:t>
+            </w:r>
+          </w:p>
+        </w:tc>
+        <w:tc>
+          <w:tcPr>
+            <w:tcW w:type="dxa" w:w="2000"/>
             <w:tcMar>
               <w:top w:type="dxa" w:w="50"/>
               <w:left w:type="dxa" w:w="80"/>
@@ -2538,33 +2638,60 @@
       <w:tr>
         <w:tc>
           <w:tcPr>
-            <w:tcW w:type="dxa" w:w="3400"/>
-            <w:tcMar>
-              <w:top w:type="dxa" w:w="50"/>
-              <w:left w:type="dxa" w:w="80"/>
-              <w:bottom w:type="dxa" w:w="50"/>
-              <w:right w:type="dxa" w:w="80"/>
-            </w:tcMar>
-          </w:tcPr>
-          <w:p>
-            <w:pPr>
-              <w:spacing w:after="0"/>
-              <w:jc w:val="left"/>
-            </w:pPr>
-            <w:r>
-              <w:rPr>
-                <w:b w:val="false"/>
-                <w:bCs w:val="false"/>
-                <w:sz w:val="18"/>
-                <w:szCs w:val="18"/>
-              </w:rPr>
-              <w:t xml:space="preserve">NO2-Pyr</w:t>
-            </w:r>
-          </w:p>
-        </w:tc>
-        <w:tc>
-          <w:tcPr>
-            <w:tcW w:type="dxa" w:w="3600"/>
+            <w:tcW w:type="dxa" w:w="3000"/>
+            <w:tcMar>
+              <w:top w:type="dxa" w:w="50"/>
+              <w:left w:type="dxa" w:w="80"/>
+              <w:bottom w:type="dxa" w:w="50"/>
+              <w:right w:type="dxa" w:w="80"/>
+            </w:tcMar>
+          </w:tcPr>
+          <w:p>
+            <w:pPr>
+              <w:spacing w:after="0"/>
+              <w:jc w:val="left"/>
+            </w:pPr>
+            <w:r>
+              <w:rPr>
+                <w:b w:val="false"/>
+                <w:bCs w:val="false"/>
+                <w:sz w:val="18"/>
+                <w:szCs w:val="18"/>
+              </w:rPr>
+              <w:t xml:space="preserve">Pyridine</w:t>
+            </w:r>
+          </w:p>
+        </w:tc>
+        <w:tc>
+          <w:tcPr>
+            <w:tcW w:type="dxa" w:w="2000"/>
+            <w:tcMar>
+              <w:top w:type="dxa" w:w="50"/>
+              <w:left w:type="dxa" w:w="80"/>
+              <w:bottom w:type="dxa" w:w="50"/>
+              <w:right w:type="dxa" w:w="80"/>
+            </w:tcMar>
+          </w:tcPr>
+          <w:p>
+            <w:pPr>
+              <w:spacing w:after="0"/>
+              <w:jc w:val="right"/>
+            </w:pPr>
+            <w:r>
+              <w:rPr>
+                <w:rFonts w:ascii="Consolas" w:cs="Consolas" w:eastAsia="Consolas" w:hAnsi="Consolas"/>
+                <w:b w:val="false"/>
+                <w:bCs w:val="false"/>
+                <w:sz w:val="18"/>
+                <w:szCs w:val="18"/>
+              </w:rPr>
+              <w:t xml:space="preserve">1 of 3</w:t>
+            </w:r>
+          </w:p>
+        </w:tc>
+        <w:tc>
+          <w:tcPr>
+            <w:tcW w:type="dxa" w:w="2000"/>
             <w:tcMar>
               <w:top w:type="dxa" w:w="50"/>
               <w:left w:type="dxa" w:w="80"/>
@@ -2593,54 +2720,81 @@
       <w:tr>
         <w:tc>
           <w:tcPr>
-            <w:tcW w:type="dxa" w:w="3400"/>
-            <w:tcMar>
-              <w:top w:type="dxa" w:w="50"/>
-              <w:left w:type="dxa" w:w="80"/>
-              <w:bottom w:type="dxa" w:w="50"/>
-              <w:right w:type="dxa" w:w="80"/>
-            </w:tcMar>
-          </w:tcPr>
-          <w:p>
-            <w:pPr>
-              <w:spacing w:after="0"/>
-              <w:jc w:val="left"/>
-            </w:pPr>
-            <w:r>
-              <w:rPr>
-                <w:b w:val="false"/>
-                <w:bCs w:val="false"/>
-                <w:sz w:val="18"/>
-                <w:szCs w:val="18"/>
-              </w:rPr>
-              <w:t xml:space="preserve">bromobenzene</w:t>
-            </w:r>
-          </w:p>
-        </w:tc>
-        <w:tc>
-          <w:tcPr>
-            <w:tcW w:type="dxa" w:w="3600"/>
-            <w:tcMar>
-              <w:top w:type="dxa" w:w="50"/>
-              <w:left w:type="dxa" w:w="80"/>
-              <w:bottom w:type="dxa" w:w="50"/>
-              <w:right w:type="dxa" w:w="80"/>
-            </w:tcMar>
-          </w:tcPr>
-          <w:p>
-            <w:pPr>
-              <w:spacing w:after="0"/>
-              <w:jc w:val="right"/>
-            </w:pPr>
-            <w:r>
-              <w:rPr>
-                <w:rFonts w:ascii="Consolas" w:cs="Consolas" w:eastAsia="Consolas" w:hAnsi="Consolas"/>
-                <w:b w:val="false"/>
-                <w:bCs w:val="false"/>
-                <w:sz w:val="18"/>
-                <w:szCs w:val="18"/>
-              </w:rPr>
-              <w:t xml:space="preserve">1 of 3</w:t>
+            <w:tcW w:type="dxa" w:w="3000"/>
+            <w:tcMar>
+              <w:top w:type="dxa" w:w="50"/>
+              <w:left w:type="dxa" w:w="80"/>
+              <w:bottom w:type="dxa" w:w="50"/>
+              <w:right w:type="dxa" w:w="80"/>
+            </w:tcMar>
+          </w:tcPr>
+          <w:p>
+            <w:pPr>
+              <w:spacing w:after="0"/>
+              <w:jc w:val="left"/>
+            </w:pPr>
+            <w:r>
+              <w:rPr>
+                <w:b w:val="false"/>
+                <w:bCs w:val="false"/>
+                <w:sz w:val="18"/>
+                <w:szCs w:val="18"/>
+              </w:rPr>
+              <w:t xml:space="preserve">CN-Pyr</w:t>
+            </w:r>
+          </w:p>
+        </w:tc>
+        <w:tc>
+          <w:tcPr>
+            <w:tcW w:type="dxa" w:w="2000"/>
+            <w:tcMar>
+              <w:top w:type="dxa" w:w="50"/>
+              <w:left w:type="dxa" w:w="80"/>
+              <w:bottom w:type="dxa" w:w="50"/>
+              <w:right w:type="dxa" w:w="80"/>
+            </w:tcMar>
+          </w:tcPr>
+          <w:p>
+            <w:pPr>
+              <w:spacing w:after="0"/>
+              <w:jc w:val="right"/>
+            </w:pPr>
+            <w:r>
+              <w:rPr>
+                <w:rFonts w:ascii="Consolas" w:cs="Consolas" w:eastAsia="Consolas" w:hAnsi="Consolas"/>
+                <w:b w:val="false"/>
+                <w:bCs w:val="false"/>
+                <w:sz w:val="18"/>
+                <w:szCs w:val="18"/>
+              </w:rPr>
+              <w:t xml:space="preserve">2 of 3</w:t>
+            </w:r>
+          </w:p>
+        </w:tc>
+        <w:tc>
+          <w:tcPr>
+            <w:tcW w:type="dxa" w:w="2000"/>
+            <w:tcMar>
+              <w:top w:type="dxa" w:w="50"/>
+              <w:left w:type="dxa" w:w="80"/>
+              <w:bottom w:type="dxa" w:w="50"/>
+              <w:right w:type="dxa" w:w="80"/>
+            </w:tcMar>
+          </w:tcPr>
+          <w:p>
+            <w:pPr>
+              <w:spacing w:after="0"/>
+              <w:jc w:val="right"/>
+            </w:pPr>
+            <w:r>
+              <w:rPr>
+                <w:rFonts w:ascii="Consolas" w:cs="Consolas" w:eastAsia="Consolas" w:hAnsi="Consolas"/>
+                <w:b w:val="false"/>
+                <w:bCs w:val="false"/>
+                <w:sz w:val="18"/>
+                <w:szCs w:val="18"/>
+              </w:rPr>
+              <w:t xml:space="preserve">0 of 3</w:t>
             </w:r>
           </w:p>
         </w:tc>
@@ -2648,54 +2802,84 @@
       <w:tr>
         <w:tc>
           <w:tcPr>
-            <w:tcW w:type="dxa" w:w="3400"/>
-            <w:tcMar>
-              <w:top w:type="dxa" w:w="50"/>
-              <w:left w:type="dxa" w:w="80"/>
-              <w:bottom w:type="dxa" w:w="50"/>
-              <w:right w:type="dxa" w:w="80"/>
-            </w:tcMar>
-          </w:tcPr>
-          <w:p>
-            <w:pPr>
-              <w:spacing w:after="0"/>
-              <w:jc w:val="left"/>
-            </w:pPr>
-            <w:r>
-              <w:rPr>
-                <w:b w:val="false"/>
-                <w:bCs w:val="false"/>
-                <w:sz w:val="18"/>
-                <w:szCs w:val="18"/>
-              </w:rPr>
-              <w:t xml:space="preserve">I-Pyr</w:t>
-            </w:r>
-          </w:p>
-        </w:tc>
-        <w:tc>
-          <w:tcPr>
-            <w:tcW w:type="dxa" w:w="3600"/>
-            <w:tcMar>
-              <w:top w:type="dxa" w:w="50"/>
-              <w:left w:type="dxa" w:w="80"/>
-              <w:bottom w:type="dxa" w:w="50"/>
-              <w:right w:type="dxa" w:w="80"/>
-            </w:tcMar>
-          </w:tcPr>
-          <w:p>
-            <w:pPr>
-              <w:spacing w:after="0"/>
-              <w:jc w:val="right"/>
-            </w:pPr>
-            <w:r>
-              <w:rPr>
-                <w:rFonts w:ascii="Consolas" w:cs="Consolas" w:eastAsia="Consolas" w:hAnsi="Consolas"/>
-                <w:b w:val="false"/>
-                <w:bCs w:val="false"/>
-                <w:sz w:val="18"/>
-                <w:szCs w:val="18"/>
-              </w:rPr>
-              <w:t xml:space="preserve">1 of 3</w:t>
+            <w:tcW w:type="dxa" w:w="3000"/>
+            <w:shd w:fill="FFF3CD" w:val="clear"/>
+            <w:tcMar>
+              <w:top w:type="dxa" w:w="50"/>
+              <w:left w:type="dxa" w:w="80"/>
+              <w:bottom w:type="dxa" w:w="50"/>
+              <w:right w:type="dxa" w:w="80"/>
+            </w:tcMar>
+          </w:tcPr>
+          <w:p>
+            <w:pPr>
+              <w:spacing w:after="0"/>
+              <w:jc w:val="left"/>
+            </w:pPr>
+            <w:r>
+              <w:rPr>
+                <w:b w:val="false"/>
+                <w:bCs w:val="false"/>
+                <w:sz w:val="18"/>
+                <w:szCs w:val="18"/>
+              </w:rPr>
+              <w:t xml:space="preserve">iodobenzene</w:t>
+            </w:r>
+          </w:p>
+        </w:tc>
+        <w:tc>
+          <w:tcPr>
+            <w:tcW w:type="dxa" w:w="2000"/>
+            <w:shd w:fill="FFF3CD" w:val="clear"/>
+            <w:tcMar>
+              <w:top w:type="dxa" w:w="50"/>
+              <w:left w:type="dxa" w:w="80"/>
+              <w:bottom w:type="dxa" w:w="50"/>
+              <w:right w:type="dxa" w:w="80"/>
+            </w:tcMar>
+          </w:tcPr>
+          <w:p>
+            <w:pPr>
+              <w:spacing w:after="0"/>
+              <w:jc w:val="right"/>
+            </w:pPr>
+            <w:r>
+              <w:rPr>
+                <w:rFonts w:ascii="Consolas" w:cs="Consolas" w:eastAsia="Consolas" w:hAnsi="Consolas"/>
+                <w:b w:val="false"/>
+                <w:bCs w:val="false"/>
+                <w:sz w:val="18"/>
+                <w:szCs w:val="18"/>
+              </w:rPr>
+              <w:t xml:space="preserve">3 of 3</w:t>
+            </w:r>
+          </w:p>
+        </w:tc>
+        <w:tc>
+          <w:tcPr>
+            <w:tcW w:type="dxa" w:w="2000"/>
+            <w:shd w:fill="FFF3CD" w:val="clear"/>
+            <w:tcMar>
+              <w:top w:type="dxa" w:w="50"/>
+              <w:left w:type="dxa" w:w="80"/>
+              <w:bottom w:type="dxa" w:w="50"/>
+              <w:right w:type="dxa" w:w="80"/>
+            </w:tcMar>
+          </w:tcPr>
+          <w:p>
+            <w:pPr>
+              <w:spacing w:after="0"/>
+              <w:jc w:val="right"/>
+            </w:pPr>
+            <w:r>
+              <w:rPr>
+                <w:rFonts w:ascii="Consolas" w:cs="Consolas" w:eastAsia="Consolas" w:hAnsi="Consolas"/>
+                <w:b w:val="false"/>
+                <w:bCs w:val="false"/>
+                <w:sz w:val="18"/>
+                <w:szCs w:val="18"/>
+              </w:rPr>
+              <w:t xml:space="preserve">0 of 3</w:t>
             </w:r>
           </w:p>
         </w:tc>
@@ -2703,33 +2887,60 @@
       <w:tr>
         <w:tc>
           <w:tcPr>
-            <w:tcW w:type="dxa" w:w="3400"/>
-            <w:tcMar>
-              <w:top w:type="dxa" w:w="50"/>
-              <w:left w:type="dxa" w:w="80"/>
-              <w:bottom w:type="dxa" w:w="50"/>
-              <w:right w:type="dxa" w:w="80"/>
-            </w:tcMar>
-          </w:tcPr>
-          <w:p>
-            <w:pPr>
-              <w:spacing w:after="0"/>
-              <w:jc w:val="left"/>
-            </w:pPr>
-            <w:r>
-              <w:rPr>
-                <w:b w:val="false"/>
-                <w:bCs w:val="false"/>
-                <w:sz w:val="18"/>
-                <w:szCs w:val="18"/>
-              </w:rPr>
-              <w:t xml:space="preserve">Me-Pyr</w:t>
-            </w:r>
-          </w:p>
-        </w:tc>
-        <w:tc>
-          <w:tcPr>
-            <w:tcW w:type="dxa" w:w="3600"/>
+            <w:tcW w:type="dxa" w:w="3000"/>
+            <w:tcMar>
+              <w:top w:type="dxa" w:w="50"/>
+              <w:left w:type="dxa" w:w="80"/>
+              <w:bottom w:type="dxa" w:w="50"/>
+              <w:right w:type="dxa" w:w="80"/>
+            </w:tcMar>
+          </w:tcPr>
+          <w:p>
+            <w:pPr>
+              <w:spacing w:after="0"/>
+              <w:jc w:val="left"/>
+            </w:pPr>
+            <w:r>
+              <w:rPr>
+                <w:b w:val="false"/>
+                <w:bCs w:val="false"/>
+                <w:sz w:val="18"/>
+                <w:szCs w:val="18"/>
+              </w:rPr>
+              <w:t xml:space="preserve">I-Pyr</w:t>
+            </w:r>
+          </w:p>
+        </w:tc>
+        <w:tc>
+          <w:tcPr>
+            <w:tcW w:type="dxa" w:w="2000"/>
+            <w:tcMar>
+              <w:top w:type="dxa" w:w="50"/>
+              <w:left w:type="dxa" w:w="80"/>
+              <w:bottom w:type="dxa" w:w="50"/>
+              <w:right w:type="dxa" w:w="80"/>
+            </w:tcMar>
+          </w:tcPr>
+          <w:p>
+            <w:pPr>
+              <w:spacing w:after="0"/>
+              <w:jc w:val="right"/>
+            </w:pPr>
+            <w:r>
+              <w:rPr>
+                <w:rFonts w:ascii="Consolas" w:cs="Consolas" w:eastAsia="Consolas" w:hAnsi="Consolas"/>
+                <w:b w:val="false"/>
+                <w:bCs w:val="false"/>
+                <w:sz w:val="18"/>
+                <w:szCs w:val="18"/>
+              </w:rPr>
+              <w:t xml:space="preserve">1 of 3</w:t>
+            </w:r>
+          </w:p>
+        </w:tc>
+        <w:tc>
+          <w:tcPr>
+            <w:tcW w:type="dxa" w:w="2000"/>
             <w:tcMar>
               <w:top w:type="dxa" w:w="50"/>
               <w:left w:type="dxa" w:w="80"/>
@@ -2758,33 +2969,33 @@
       <w:tr>
         <w:tc>
           <w:tcPr>
-            <w:tcW w:type="dxa" w:w="3400"/>
-            <w:tcMar>
-              <w:top w:type="dxa" w:w="50"/>
-              <w:left w:type="dxa" w:w="80"/>
-              <w:bottom w:type="dxa" w:w="50"/>
-              <w:right w:type="dxa" w:w="80"/>
-            </w:tcMar>
-          </w:tcPr>
-          <w:p>
-            <w:pPr>
-              <w:spacing w:after="0"/>
-              <w:jc w:val="left"/>
-            </w:pPr>
-            <w:r>
-              <w:rPr>
-                <w:b w:val="false"/>
-                <w:bCs w:val="false"/>
-                <w:sz w:val="18"/>
-                <w:szCs w:val="18"/>
-              </w:rPr>
-              <w:t xml:space="preserve">Pyridine</w:t>
-            </w:r>
-          </w:p>
-        </w:tc>
-        <w:tc>
-          <w:tcPr>
-            <w:tcW w:type="dxa" w:w="3600"/>
+            <w:tcW w:type="dxa" w:w="3000"/>
+            <w:tcMar>
+              <w:top w:type="dxa" w:w="50"/>
+              <w:left w:type="dxa" w:w="80"/>
+              <w:bottom w:type="dxa" w:w="50"/>
+              <w:right w:type="dxa" w:w="80"/>
+            </w:tcMar>
+          </w:tcPr>
+          <w:p>
+            <w:pPr>
+              <w:spacing w:after="0"/>
+              <w:jc w:val="left"/>
+            </w:pPr>
+            <w:r>
+              <w:rPr>
+                <w:b w:val="false"/>
+                <w:bCs w:val="false"/>
+                <w:sz w:val="18"/>
+                <w:szCs w:val="18"/>
+              </w:rPr>
+              <w:t xml:space="preserve">Me-Pyr</w:t>
+            </w:r>
+          </w:p>
+        </w:tc>
+        <w:tc>
+          <w:tcPr>
+            <w:tcW w:type="dxa" w:w="2000"/>
             <w:tcMar>
               <w:top w:type="dxa" w:w="50"/>
               <w:left w:type="dxa" w:w="80"/>
@@ -2806,6 +3017,33 @@
                 <w:szCs w:val="18"/>
               </w:rPr>
               <w:t xml:space="preserve">1 of 3</w:t>
+            </w:r>
+          </w:p>
+        </w:tc>
+        <w:tc>
+          <w:tcPr>
+            <w:tcW w:type="dxa" w:w="2000"/>
+            <w:tcMar>
+              <w:top w:type="dxa" w:w="50"/>
+              <w:left w:type="dxa" w:w="80"/>
+              <w:bottom w:type="dxa" w:w="50"/>
+              <w:right w:type="dxa" w:w="80"/>
+            </w:tcMar>
+          </w:tcPr>
+          <w:p>
+            <w:pPr>
+              <w:spacing w:after="0"/>
+              <w:jc w:val="right"/>
+            </w:pPr>
+            <w:r>
+              <w:rPr>
+                <w:rFonts w:ascii="Consolas" w:cs="Consolas" w:eastAsia="Consolas" w:hAnsi="Consolas"/>
+                <w:b w:val="false"/>
+                <w:bCs w:val="false"/>
+                <w:sz w:val="18"/>
+                <w:szCs w:val="18"/>
+              </w:rPr>
+              <w:t xml:space="preserve">2 of 3</w:t>
             </w:r>
           </w:p>
         </w:tc>
@@ -2813,33 +3051,60 @@
       <w:tr>
         <w:tc>
           <w:tcPr>
-            <w:tcW w:type="dxa" w:w="3400"/>
-            <w:tcMar>
-              <w:top w:type="dxa" w:w="50"/>
-              <w:left w:type="dxa" w:w="80"/>
-              <w:bottom w:type="dxa" w:w="50"/>
-              <w:right w:type="dxa" w:w="80"/>
-            </w:tcMar>
-          </w:tcPr>
-          <w:p>
-            <w:pPr>
-              <w:spacing w:after="0"/>
-              <w:jc w:val="left"/>
-            </w:pPr>
-            <w:r>
-              <w:rPr>
-                <w:b w:val="false"/>
-                <w:bCs w:val="false"/>
-                <w:sz w:val="18"/>
-                <w:szCs w:val="18"/>
-              </w:rPr>
-              <w:t xml:space="preserve">CN-Pyr</w:t>
-            </w:r>
-          </w:p>
-        </w:tc>
-        <w:tc>
-          <w:tcPr>
-            <w:tcW w:type="dxa" w:w="3600"/>
+            <w:tcW w:type="dxa" w:w="3000"/>
+            <w:tcMar>
+              <w:top w:type="dxa" w:w="50"/>
+              <w:left w:type="dxa" w:w="80"/>
+              <w:bottom w:type="dxa" w:w="50"/>
+              <w:right w:type="dxa" w:w="80"/>
+            </w:tcMar>
+          </w:tcPr>
+          <w:p>
+            <w:pPr>
+              <w:spacing w:after="0"/>
+              <w:jc w:val="left"/>
+            </w:pPr>
+            <w:r>
+              <w:rPr>
+                <w:b w:val="false"/>
+                <w:bCs w:val="false"/>
+                <w:sz w:val="18"/>
+                <w:szCs w:val="18"/>
+              </w:rPr>
+              <w:t xml:space="preserve">bromobenzene</w:t>
+            </w:r>
+          </w:p>
+        </w:tc>
+        <w:tc>
+          <w:tcPr>
+            <w:tcW w:type="dxa" w:w="2000"/>
+            <w:tcMar>
+              <w:top w:type="dxa" w:w="50"/>
+              <w:left w:type="dxa" w:w="80"/>
+              <w:bottom w:type="dxa" w:w="50"/>
+              <w:right w:type="dxa" w:w="80"/>
+            </w:tcMar>
+          </w:tcPr>
+          <w:p>
+            <w:pPr>
+              <w:spacing w:after="0"/>
+              <w:jc w:val="right"/>
+            </w:pPr>
+            <w:r>
+              <w:rPr>
+                <w:rFonts w:ascii="Consolas" w:cs="Consolas" w:eastAsia="Consolas" w:hAnsi="Consolas"/>
+                <w:b w:val="false"/>
+                <w:bCs w:val="false"/>
+                <w:sz w:val="18"/>
+                <w:szCs w:val="18"/>
+              </w:rPr>
+              <w:t xml:space="preserve">1 of 3</w:t>
+            </w:r>
+          </w:p>
+        </w:tc>
+        <w:tc>
+          <w:tcPr>
+            <w:tcW w:type="dxa" w:w="2000"/>
             <w:tcMar>
               <w:top w:type="dxa" w:w="50"/>
               <w:left w:type="dxa" w:w="80"/>
@@ -2868,56 +3133,81 @@
       <w:tr>
         <w:tc>
           <w:tcPr>
-            <w:tcW w:type="dxa" w:w="3400"/>
-            <w:shd w:fill="FFF3CD" w:val="clear"/>
-            <w:tcMar>
-              <w:top w:type="dxa" w:w="50"/>
-              <w:left w:type="dxa" w:w="80"/>
-              <w:bottom w:type="dxa" w:w="50"/>
-              <w:right w:type="dxa" w:w="80"/>
-            </w:tcMar>
-          </w:tcPr>
-          <w:p>
-            <w:pPr>
-              <w:spacing w:after="0"/>
-              <w:jc w:val="left"/>
-            </w:pPr>
-            <w:r>
-              <w:rPr>
-                <w:b w:val="false"/>
-                <w:bCs w:val="false"/>
-                <w:sz w:val="18"/>
-                <w:szCs w:val="18"/>
-              </w:rPr>
-              <w:t xml:space="preserve">iodobenzene</w:t>
-            </w:r>
-          </w:p>
-        </w:tc>
-        <w:tc>
-          <w:tcPr>
-            <w:tcW w:type="dxa" w:w="3600"/>
-            <w:shd w:fill="FFF3CD" w:val="clear"/>
-            <w:tcMar>
-              <w:top w:type="dxa" w:w="50"/>
-              <w:left w:type="dxa" w:w="80"/>
-              <w:bottom w:type="dxa" w:w="50"/>
-              <w:right w:type="dxa" w:w="80"/>
-            </w:tcMar>
-          </w:tcPr>
-          <w:p>
-            <w:pPr>
-              <w:spacing w:after="0"/>
-              <w:jc w:val="right"/>
-            </w:pPr>
-            <w:r>
-              <w:rPr>
-                <w:rFonts w:ascii="Consolas" w:cs="Consolas" w:eastAsia="Consolas" w:hAnsi="Consolas"/>
-                <w:b w:val="false"/>
-                <w:bCs w:val="false"/>
-                <w:sz w:val="18"/>
-                <w:szCs w:val="18"/>
-              </w:rPr>
-              <w:t xml:space="preserve">3 of 3</w:t>
+            <w:tcW w:type="dxa" w:w="3000"/>
+            <w:tcMar>
+              <w:top w:type="dxa" w:w="50"/>
+              <w:left w:type="dxa" w:w="80"/>
+              <w:bottom w:type="dxa" w:w="50"/>
+              <w:right w:type="dxa" w:w="80"/>
+            </w:tcMar>
+          </w:tcPr>
+          <w:p>
+            <w:pPr>
+              <w:spacing w:after="0"/>
+              <w:jc w:val="left"/>
+            </w:pPr>
+            <w:r>
+              <w:rPr>
+                <w:b w:val="false"/>
+                <w:bCs w:val="false"/>
+                <w:sz w:val="18"/>
+                <w:szCs w:val="18"/>
+              </w:rPr>
+              <w:t xml:space="preserve">NO2-Pyr</w:t>
+            </w:r>
+          </w:p>
+        </w:tc>
+        <w:tc>
+          <w:tcPr>
+            <w:tcW w:type="dxa" w:w="2000"/>
+            <w:tcMar>
+              <w:top w:type="dxa" w:w="50"/>
+              <w:left w:type="dxa" w:w="80"/>
+              <w:bottom w:type="dxa" w:w="50"/>
+              <w:right w:type="dxa" w:w="80"/>
+            </w:tcMar>
+          </w:tcPr>
+          <w:p>
+            <w:pPr>
+              <w:spacing w:after="0"/>
+              <w:jc w:val="right"/>
+            </w:pPr>
+            <w:r>
+              <w:rPr>
+                <w:rFonts w:ascii="Consolas" w:cs="Consolas" w:eastAsia="Consolas" w:hAnsi="Consolas"/>
+                <w:b w:val="false"/>
+                <w:bCs w:val="false"/>
+                <w:sz w:val="18"/>
+                <w:szCs w:val="18"/>
+              </w:rPr>
+              <w:t xml:space="preserve">0 of 3</w:t>
+            </w:r>
+          </w:p>
+        </w:tc>
+        <w:tc>
+          <w:tcPr>
+            <w:tcW w:type="dxa" w:w="2000"/>
+            <w:tcMar>
+              <w:top w:type="dxa" w:w="50"/>
+              <w:left w:type="dxa" w:w="80"/>
+              <w:bottom w:type="dxa" w:w="50"/>
+              <w:right w:type="dxa" w:w="80"/>
+            </w:tcMar>
+          </w:tcPr>
+          <w:p>
+            <w:pPr>
+              <w:spacing w:after="0"/>
+              <w:jc w:val="right"/>
+            </w:pPr>
+            <w:r>
+              <w:rPr>
+                <w:rFonts w:ascii="Consolas" w:cs="Consolas" w:eastAsia="Consolas" w:hAnsi="Consolas"/>
+                <w:b w:val="false"/>
+                <w:bCs w:val="false"/>
+                <w:sz w:val="18"/>
+                <w:szCs w:val="18"/>
+              </w:rPr>
+              <w:t xml:space="preserve">2 of 3</w:t>
             </w:r>
           </w:p>
         </w:tc>
@@ -2933,17 +3223,32 @@
         <w:spacing w:after="140"/>
       </w:pPr>
       <w:r>
-        <w:t xml:space="preserve">Nine of twenty-seven views, exactly one third. Iodobenzene lost all three, which is why its axial view in Figure 2 is the flattest of the row. </w:t>
+        <w:t xml:space="preserve">Nine of twenty-seven views in the first run, seven in the second, with the set almost completely exchanged. </w:t>
       </w:r>
       <w:r>
         <w:rPr>
           <w:b/>
           <w:bCs/>
         </w:rPr>
-        <w:t xml:space="preserve">PyMOL's ray tracer rendered all twenty-seven without a single failure.</w:t>
-      </w:r>
-      <w:r>
-        <w:t xml:space="preserve"> Which pass produced which view is recorded per view in the *_settings.txt next to the images and in the views column of summary.csv, so a figure made the fallback way is never silently mixed in with the others.</w:t>
+        <w:t xml:space="preserve">The failure is therefore not a property of the molecule.</w:t>
+      </w:r>
+      <w:r>
+        <w:t xml:space="preserve"> Iodobenzene lost all three views in the first run and none in the second; NO2-Pyr went the other way. Only the two extremes stayed put: chlorobenzene and Cl-NO2-Pyr came through both times. So the rate is a property of the renderer and of how much transparent surface a view crosses, and the particular molecule that suffers on a given day is chance.</w:t>
+      </w:r>
+    </w:p>
+    <w:p>
+      <w:pPr>
+        <w:spacing w:after="140"/>
+      </w:pPr>
+      <w:r>
+        <w:rPr>
+          <w:b/>
+          <w:bCs/>
+        </w:rPr>
+        <w:t xml:space="preserve">PyMOL's ray tracer rendered all twenty-seven without a single failure, in both runs.</w:t>
+      </w:r>
+      <w:r>
+        <w:t xml:space="preserve"> Which pass produced which view is recorded per view in the *_settings.txt next to the images and in the views column of the summary CSV, as e.g. pi:transparency;edge:transparency, window capture, so a figure made the fallback way is never silently mixed in with the others. That record is the reason the two runs could be compared at all.</w:t>
       </w:r>
     </w:p>
     <w:p>

</xml_diff>